<commit_message>
fix: clarify NEWS2 is one option, not a mandated scale (AAC5)
NEWS2 (Royal College of Physicians) was the only named early-warning
tool. Added a note that NABH does not mandate NEWS2 specifically —
MEWS, qSOFA, a paediatric equivalent, or the hospital's own locally
validated parameter set are equally acceptable.

Co-Authored-By: Claude Sonnet 5 <noreply@anthropic.com>
Claude-Session: https://claude.ai/code/session_01TPRLtLhmTCP5z94Q3FiE5v
</commit_message>
<xml_diff>
--- a/policies/build/chapters_v2/AAC/document/AAC5/SOP_Early_Warning_Escalation.docx
+++ b/policies/build/chapters_v2/AAC/document/AAC5/SOP_Early_Warning_Escalation.docx
@@ -321,26 +321,17 @@
     </w:p>
     <w:p>
       <w:r>
-        <w:t xml:space="preserve">Any Staff Member Observing a Trigger: </w:t>
-      </w:r>
-      <w:r>
-        <w:t>escalates immediately — this is not limited to nursing or doctors on duty.</w:t>
+        <w:t xml:space="preserve">Any Staff Member Observing a Trigger: escalates immediately — this is not limited to nursing or doctors on duty.</w:t>
       </w:r>
     </w:p>
     <w:p>
       <w:r>
-        <w:t xml:space="preserve">On-Call / Responding Doctor: </w:t>
-      </w:r>
-      <w:r>
-        <w:t>acts on the escalation promptly and documents the response.</w:t>
+        <w:t xml:space="preserve">On-Call / Responding Doctor: acts on the escalation promptly and documents the response.</w:t>
       </w:r>
     </w:p>
     <w:p>
       <w:r>
-        <w:t xml:space="preserve">Quality Coordinator: </w:t>
-      </w:r>
-      <w:r>
-        <w:t>reviews early-warning system effectiveness at a defined interval and investigates every failure-to-escalate event.</w:t>
+        <w:t xml:space="preserve">Quality Coordinator: reviews early-warning system effectiveness at a defined interval and investigates every failure-to-escalate event.</w:t>
       </w:r>
     </w:p>
     <w:p>
@@ -441,6 +432,14 @@
           <w:t>Royal College of Physicians. (2017). National Early Warning Score (NEWS) 2: Standardising the assessment of acute-illness severity in the NHS.</w:t>
         </w:r>
       </w:hyperlink>
+    </w:p>
+    <w:p>
+      <w:pPr>
+        <w:pStyle w:val="ListParagraph"/>
+      </w:pPr>
+      <w:r>
+        <w:t>Note: NABH does not mandate NEWS2 or any single early-warning scale. NEWS2 is cited as one recognised, structured example; MEWS, qSOFA, a paediatric equivalent (e.g. PEWS), or the hospital’s own locally validated parameter set are equally acceptable, provided the hospital defines one basis and applies it consistently.</w:t>
+      </w:r>
     </w:p>
     <w:p>
       <w:pPr>

</xml_diff>